<commit_message>
Docs: guide utilisateur avec captures d'écran réelles intégrées
10 écrans capturés automatiquement sur une stack locale isolée (données factices,
aucune donnée client réelle) et embarqués dans le .docx et le .pptx : connexion,
accueil client, identité, vue d'ensemble admin (KPI), config, utilisateurs,
tableau des transactions, espace conseiller, recherche + fiche imprimeur.
Les écrans caméra/validation MoMo restent en emplacement à remplir.

Co-Authored-By: Claude Opus 4.8 (1M context) <noreply@anthropic.com>
</commit_message>
<xml_diff>
--- a/docs/Guide-utilisateur-Carte-Promote.docx
+++ b/docs/Guide-utilisateur-Carte-Promote.docx
@@ -48,7 +48,7 @@
         </w:numPr>
       </w:pPr>
       <w:r>
-        <w:t xml:space="preserve">Les cadres « 📷 Capture » sont à remplir avec vos propres copies d'écran.</w:t>
+        <w:t xml:space="preserve">Captures réelles ci-après ; les écrans caméra/validation MoMo restent en emplacement à remplir.</w:t>
       </w:r>
     </w:p>
     <w:p>
@@ -105,64 +105,66 @@
         <w:t xml:space="preserve">Le système ouvre l'espace correspondant au rôle du compte.</w:t>
       </w:r>
     </w:p>
-    <w:tbl>
-      <w:tblPr>
-        <w:tblW w:w="9300" w:type="dxa"/>
-        <w:tblBorders>
-          <w:top w:val="dashed" w:sz="6" w:space="0" w:color="BBBBBB"/>
-          <w:left w:val="dashed" w:sz="6" w:space="0" w:color="BBBBBB"/>
-          <w:bottom w:val="dashed" w:sz="6" w:space="0" w:color="BBBBBB"/>
-          <w:right w:val="dashed" w:sz="6" w:space="0" w:color="BBBBBB"/>
-          <w:insideH w:val="dashed" w:sz="6" w:space="0" w:color="BBBBBB"/>
-          <w:insideV w:val="dashed" w:sz="6" w:space="0" w:color="BBBBBB"/>
-        </w:tblBorders>
-        <w:tblCellMar>
-          <w:top w:w="120" w:type="dxa"/>
-          <w:bottom w:w="120" w:type="dxa"/>
-        </w:tblCellMar>
-      </w:tblPr>
-      <w:tblGrid>
-        <w:gridCol w:w="9300"/>
-      </w:tblGrid>
-      <w:tr>
-        <w:tc>
-          <w:tcPr>
-            <w:tcW w:w="9300" w:type="dxa"/>
-            <w:shd w:val="clear" w:color="auto" w:fill="F4F4F4"/>
-            <w:vAlign w:val="center"/>
-          </w:tcPr>
-          <w:p>
-            <w:pPr>
-              <w:jc w:val="center"/>
-            </w:pPr>
-            <w:r>
-              <w:rPr>
-                <w:b/>
-                <w:color w:val="888888"/>
-              </w:rPr>
-              <w:t xml:space="preserve">📷 Capture : Écran de connexion</w:t>
-            </w:r>
-          </w:p>
-          <w:p>
-            <w:pPr>
-              <w:jc w:val="center"/>
-            </w:pPr>
-            <w:r>
-              <w:rPr>
-                <w:color w:val="AAAAAA"/>
-                <w:sz w:val="18"/>
-              </w:rPr>
-              <w:t>(insérer la copie d’écran ici)</w:t>
-            </w:r>
-          </w:p>
-          <w:p/>
-          <w:p/>
-          <w:p/>
-          <w:p/>
-        </w:tc>
-      </w:tr>
-    </w:tbl>
-    <w:p/>
+    <w:p>
+      <w:pPr>
+        <w:spacing w:before="80" w:after="40"/>
+      </w:pPr>
+      <w:r>
+        <w:drawing>
+          <wp:inline xmlns:wp="http://schemas.openxmlformats.org/drawingml/2006/wordprocessingDrawing" distT="0" distB="0" distL="0" distR="0">
+            <wp:extent cx="2104255" cy="4300000"/>
+            <wp:effectExtent l="0" t="0" r="0" b="0"/>
+            <wp:docPr id="101" name="img101"/>
+            <wp:cNvGraphicFramePr>
+              <a:graphicFrameLocks xmlns:a="http://schemas.openxmlformats.org/drawingml/2006/main" noChangeAspect="1"/>
+            </wp:cNvGraphicFramePr>
+            <a:graphic xmlns:a="http://schemas.openxmlformats.org/drawingml/2006/main">
+              <a:graphicData uri="http://schemas.openxmlformats.org/drawingml/2006/picture">
+                <pic:pic xmlns:pic="http://schemas.openxmlformats.org/drawingml/2006/picture">
+                  <pic:nvPicPr>
+                    <pic:cNvPr id="101" name="img101"/>
+                    <pic:cNvPicPr/>
+                  </pic:nvPicPr>
+                  <pic:blipFill>
+                    <a:blip xmlns:r="http://schemas.openxmlformats.org/officeDocument/2006/relationships" r:embed="rIdImg11"/>
+                    <a:stretch>
+                      <a:fillRect/>
+                    </a:stretch>
+                  </pic:blipFill>
+                  <pic:spPr>
+                    <a:xfrm>
+                      <a:off x="0" y="0"/>
+                      <a:ext cx="2104255" cy="4300000"/>
+                    </a:xfrm>
+                    <a:prstGeom prst="rect">
+                      <a:avLst/>
+                    </a:prstGeom>
+                    <a:ln w="9525">
+                      <a:solidFill>
+                        <a:srgbClr val="DDDDDD"/>
+                      </a:solidFill>
+                    </a:ln>
+                  </pic:spPr>
+                </pic:pic>
+              </a:graphicData>
+            </a:graphic>
+          </wp:inline>
+        </w:drawing>
+      </w:r>
+    </w:p>
+    <w:p>
+      <w:pPr>
+        <w:spacing w:after="160"/>
+      </w:pPr>
+      <w:r>
+        <w:rPr>
+          <w:i/>
+          <w:color w:val="888888"/>
+          <w:sz w:val="18"/>
+        </w:rPr>
+        <w:t xml:space="preserve">Capture : Écran de connexion</w:t>
+      </w:r>
+    </w:p>
     <w:p>
       <w:pPr>
         <w:pStyle w:val="Heading2"/>
@@ -311,64 +313,66 @@
         <w:t xml:space="preserve">Les 3 étapes sont rappelées, puis bouton « Commencer ».</w:t>
       </w:r>
     </w:p>
-    <w:tbl>
-      <w:tblPr>
-        <w:tblW w:w="9300" w:type="dxa"/>
-        <w:tblBorders>
-          <w:top w:val="dashed" w:sz="6" w:space="0" w:color="BBBBBB"/>
-          <w:left w:val="dashed" w:sz="6" w:space="0" w:color="BBBBBB"/>
-          <w:bottom w:val="dashed" w:sz="6" w:space="0" w:color="BBBBBB"/>
-          <w:right w:val="dashed" w:sz="6" w:space="0" w:color="BBBBBB"/>
-          <w:insideH w:val="dashed" w:sz="6" w:space="0" w:color="BBBBBB"/>
-          <w:insideV w:val="dashed" w:sz="6" w:space="0" w:color="BBBBBB"/>
-        </w:tblBorders>
-        <w:tblCellMar>
-          <w:top w:w="120" w:type="dxa"/>
-          <w:bottom w:w="120" w:type="dxa"/>
-        </w:tblCellMar>
-      </w:tblPr>
-      <w:tblGrid>
-        <w:gridCol w:w="9300"/>
-      </w:tblGrid>
-      <w:tr>
-        <w:tc>
-          <w:tcPr>
-            <w:tcW w:w="9300" w:type="dxa"/>
-            <w:shd w:val="clear" w:color="auto" w:fill="F4F4F4"/>
-            <w:vAlign w:val="center"/>
-          </w:tcPr>
-          <w:p>
-            <w:pPr>
-              <w:jc w:val="center"/>
-            </w:pPr>
-            <w:r>
-              <w:rPr>
-                <w:b/>
-                <w:color w:val="888888"/>
-              </w:rPr>
-              <w:t xml:space="preserve">📷 Capture : Accueil client (après scan du QR)</w:t>
-            </w:r>
-          </w:p>
-          <w:p>
-            <w:pPr>
-              <w:jc w:val="center"/>
-            </w:pPr>
-            <w:r>
-              <w:rPr>
-                <w:color w:val="AAAAAA"/>
-                <w:sz w:val="18"/>
-              </w:rPr>
-              <w:t>(insérer la copie d’écran ici)</w:t>
-            </w:r>
-          </w:p>
-          <w:p/>
-          <w:p/>
-          <w:p/>
-          <w:p/>
-        </w:tc>
-      </w:tr>
-    </w:tbl>
-    <w:p/>
+    <w:p>
+      <w:pPr>
+        <w:spacing w:before="80" w:after="40"/>
+      </w:pPr>
+      <w:r>
+        <w:drawing>
+          <wp:inline xmlns:wp="http://schemas.openxmlformats.org/drawingml/2006/wordprocessingDrawing" distT="0" distB="0" distL="0" distR="0">
+            <wp:extent cx="2104255" cy="4300000"/>
+            <wp:effectExtent l="0" t="0" r="0" b="0"/>
+            <wp:docPr id="102" name="img102"/>
+            <wp:cNvGraphicFramePr>
+              <a:graphicFrameLocks xmlns:a="http://schemas.openxmlformats.org/drawingml/2006/main" noChangeAspect="1"/>
+            </wp:cNvGraphicFramePr>
+            <a:graphic xmlns:a="http://schemas.openxmlformats.org/drawingml/2006/main">
+              <a:graphicData uri="http://schemas.openxmlformats.org/drawingml/2006/picture">
+                <pic:pic xmlns:pic="http://schemas.openxmlformats.org/drawingml/2006/picture">
+                  <pic:nvPicPr>
+                    <pic:cNvPr id="102" name="img102"/>
+                    <pic:cNvPicPr/>
+                  </pic:nvPicPr>
+                  <pic:blipFill>
+                    <a:blip xmlns:r="http://schemas.openxmlformats.org/officeDocument/2006/relationships" r:embed="rIdImg12"/>
+                    <a:stretch>
+                      <a:fillRect/>
+                    </a:stretch>
+                  </pic:blipFill>
+                  <pic:spPr>
+                    <a:xfrm>
+                      <a:off x="0" y="0"/>
+                      <a:ext cx="2104255" cy="4300000"/>
+                    </a:xfrm>
+                    <a:prstGeom prst="rect">
+                      <a:avLst/>
+                    </a:prstGeom>
+                    <a:ln w="9525">
+                      <a:solidFill>
+                        <a:srgbClr val="DDDDDD"/>
+                      </a:solidFill>
+                    </a:ln>
+                  </pic:spPr>
+                </pic:pic>
+              </a:graphicData>
+            </a:graphic>
+          </wp:inline>
+        </w:drawing>
+      </w:r>
+    </w:p>
+    <w:p>
+      <w:pPr>
+        <w:spacing w:after="160"/>
+      </w:pPr>
+      <w:r>
+        <w:rPr>
+          <w:i/>
+          <w:color w:val="888888"/>
+          <w:sz w:val="18"/>
+        </w:rPr>
+        <w:t xml:space="preserve">Capture : Accueil client (après scan du QR)</w:t>
+      </w:r>
+    </w:p>
     <w:p>
       <w:pPr>
         <w:pStyle w:val="Heading2"/>
@@ -421,64 +425,66 @@
         <w:t xml:space="preserve">E-mail, quartier, ville. Puis « Continuer ».</w:t>
       </w:r>
     </w:p>
-    <w:tbl>
-      <w:tblPr>
-        <w:tblW w:w="9300" w:type="dxa"/>
-        <w:tblBorders>
-          <w:top w:val="dashed" w:sz="6" w:space="0" w:color="BBBBBB"/>
-          <w:left w:val="dashed" w:sz="6" w:space="0" w:color="BBBBBB"/>
-          <w:bottom w:val="dashed" w:sz="6" w:space="0" w:color="BBBBBB"/>
-          <w:right w:val="dashed" w:sz="6" w:space="0" w:color="BBBBBB"/>
-          <w:insideH w:val="dashed" w:sz="6" w:space="0" w:color="BBBBBB"/>
-          <w:insideV w:val="dashed" w:sz="6" w:space="0" w:color="BBBBBB"/>
-        </w:tblBorders>
-        <w:tblCellMar>
-          <w:top w:w="120" w:type="dxa"/>
-          <w:bottom w:w="120" w:type="dxa"/>
-        </w:tblCellMar>
-      </w:tblPr>
-      <w:tblGrid>
-        <w:gridCol w:w="9300"/>
-      </w:tblGrid>
-      <w:tr>
-        <w:tc>
-          <w:tcPr>
-            <w:tcW w:w="9300" w:type="dxa"/>
-            <w:shd w:val="clear" w:color="auto" w:fill="F4F4F4"/>
-            <w:vAlign w:val="center"/>
-          </w:tcPr>
-          <w:p>
-            <w:pPr>
-              <w:jc w:val="center"/>
-            </w:pPr>
-            <w:r>
-              <w:rPr>
-                <w:b/>
-                <w:color w:val="888888"/>
-              </w:rPr>
-              <w:t xml:space="preserve">📷 Capture : Formulaire d'identité</w:t>
-            </w:r>
-          </w:p>
-          <w:p>
-            <w:pPr>
-              <w:jc w:val="center"/>
-            </w:pPr>
-            <w:r>
-              <w:rPr>
-                <w:color w:val="AAAAAA"/>
-                <w:sz w:val="18"/>
-              </w:rPr>
-              <w:t>(insérer la copie d’écran ici)</w:t>
-            </w:r>
-          </w:p>
-          <w:p/>
-          <w:p/>
-          <w:p/>
-          <w:p/>
-        </w:tc>
-      </w:tr>
-    </w:tbl>
-    <w:p/>
+    <w:p>
+      <w:pPr>
+        <w:spacing w:before="80" w:after="40"/>
+      </w:pPr>
+      <w:r>
+        <w:drawing>
+          <wp:inline xmlns:wp="http://schemas.openxmlformats.org/drawingml/2006/wordprocessingDrawing" distT="0" distB="0" distL="0" distR="0">
+            <wp:extent cx="2104255" cy="4300000"/>
+            <wp:effectExtent l="0" t="0" r="0" b="0"/>
+            <wp:docPr id="103" name="img103"/>
+            <wp:cNvGraphicFramePr>
+              <a:graphicFrameLocks xmlns:a="http://schemas.openxmlformats.org/drawingml/2006/main" noChangeAspect="1"/>
+            </wp:cNvGraphicFramePr>
+            <a:graphic xmlns:a="http://schemas.openxmlformats.org/drawingml/2006/main">
+              <a:graphicData uri="http://schemas.openxmlformats.org/drawingml/2006/picture">
+                <pic:pic xmlns:pic="http://schemas.openxmlformats.org/drawingml/2006/picture">
+                  <pic:nvPicPr>
+                    <pic:cNvPr id="103" name="img103"/>
+                    <pic:cNvPicPr/>
+                  </pic:nvPicPr>
+                  <pic:blipFill>
+                    <a:blip xmlns:r="http://schemas.openxmlformats.org/officeDocument/2006/relationships" r:embed="rIdImg13"/>
+                    <a:stretch>
+                      <a:fillRect/>
+                    </a:stretch>
+                  </pic:blipFill>
+                  <pic:spPr>
+                    <a:xfrm>
+                      <a:off x="0" y="0"/>
+                      <a:ext cx="2104255" cy="4300000"/>
+                    </a:xfrm>
+                    <a:prstGeom prst="rect">
+                      <a:avLst/>
+                    </a:prstGeom>
+                    <a:ln w="9525">
+                      <a:solidFill>
+                        <a:srgbClr val="DDDDDD"/>
+                      </a:solidFill>
+                    </a:ln>
+                  </pic:spPr>
+                </pic:pic>
+              </a:graphicData>
+            </a:graphic>
+          </wp:inline>
+        </w:drawing>
+      </w:r>
+    </w:p>
+    <w:p>
+      <w:pPr>
+        <w:spacing w:after="160"/>
+      </w:pPr>
+      <w:r>
+        <w:rPr>
+          <w:i/>
+          <w:color w:val="888888"/>
+          <w:sz w:val="18"/>
+        </w:rPr>
+        <w:t xml:space="preserve">Capture : Formulaire d'identité</w:t>
+      </w:r>
+    </w:p>
     <w:p>
       <w:pPr>
         <w:pStyle w:val="Heading2"/>
@@ -1122,64 +1128,66 @@
         <w:t xml:space="preserve">Recherche avancée (référence, nom, NIU, téléphone).</w:t>
       </w:r>
     </w:p>
-    <w:tbl>
-      <w:tblPr>
-        <w:tblW w:w="9300" w:type="dxa"/>
-        <w:tblBorders>
-          <w:top w:val="dashed" w:sz="6" w:space="0" w:color="BBBBBB"/>
-          <w:left w:val="dashed" w:sz="6" w:space="0" w:color="BBBBBB"/>
-          <w:bottom w:val="dashed" w:sz="6" w:space="0" w:color="BBBBBB"/>
-          <w:right w:val="dashed" w:sz="6" w:space="0" w:color="BBBBBB"/>
-          <w:insideH w:val="dashed" w:sz="6" w:space="0" w:color="BBBBBB"/>
-          <w:insideV w:val="dashed" w:sz="6" w:space="0" w:color="BBBBBB"/>
-        </w:tblBorders>
-        <w:tblCellMar>
-          <w:top w:w="120" w:type="dxa"/>
-          <w:bottom w:w="120" w:type="dxa"/>
-        </w:tblCellMar>
-      </w:tblPr>
-      <w:tblGrid>
-        <w:gridCol w:w="9300"/>
-      </w:tblGrid>
-      <w:tr>
-        <w:tc>
-          <w:tcPr>
-            <w:tcW w:w="9300" w:type="dxa"/>
-            <w:shd w:val="clear" w:color="auto" w:fill="F4F4F4"/>
-            <w:vAlign w:val="center"/>
-          </w:tcPr>
-          <w:p>
-            <w:pPr>
-              <w:jc w:val="center"/>
-            </w:pPr>
-            <w:r>
-              <w:rPr>
-                <w:b/>
-                <w:color w:val="888888"/>
-              </w:rPr>
-              <w:t xml:space="preserve">📷 Capture : Tableau de bord conseiller</w:t>
-            </w:r>
-          </w:p>
-          <w:p>
-            <w:pPr>
-              <w:jc w:val="center"/>
-            </w:pPr>
-            <w:r>
-              <w:rPr>
-                <w:color w:val="AAAAAA"/>
-                <w:sz w:val="18"/>
-              </w:rPr>
-              <w:t>(insérer la copie d’écran ici)</w:t>
-            </w:r>
-          </w:p>
-          <w:p/>
-          <w:p/>
-          <w:p/>
-          <w:p/>
-        </w:tc>
-      </w:tr>
-    </w:tbl>
-    <w:p/>
+    <w:p>
+      <w:pPr>
+        <w:spacing w:before="80" w:after="40"/>
+      </w:pPr>
+      <w:r>
+        <w:drawing>
+          <wp:inline xmlns:wp="http://schemas.openxmlformats.org/drawingml/2006/wordprocessingDrawing" distT="0" distB="0" distL="0" distR="0">
+            <wp:extent cx="5600000" cy="3694444"/>
+            <wp:effectExtent l="0" t="0" r="0" b="0"/>
+            <wp:docPr id="104" name="img104"/>
+            <wp:cNvGraphicFramePr>
+              <a:graphicFrameLocks xmlns:a="http://schemas.openxmlformats.org/drawingml/2006/main" noChangeAspect="1"/>
+            </wp:cNvGraphicFramePr>
+            <a:graphic xmlns:a="http://schemas.openxmlformats.org/drawingml/2006/main">
+              <a:graphicData uri="http://schemas.openxmlformats.org/drawingml/2006/picture">
+                <pic:pic xmlns:pic="http://schemas.openxmlformats.org/drawingml/2006/picture">
+                  <pic:nvPicPr>
+                    <pic:cNvPr id="104" name="img104"/>
+                    <pic:cNvPicPr/>
+                  </pic:nvPicPr>
+                  <pic:blipFill>
+                    <a:blip xmlns:r="http://schemas.openxmlformats.org/officeDocument/2006/relationships" r:embed="rIdImg14"/>
+                    <a:stretch>
+                      <a:fillRect/>
+                    </a:stretch>
+                  </pic:blipFill>
+                  <pic:spPr>
+                    <a:xfrm>
+                      <a:off x="0" y="0"/>
+                      <a:ext cx="5600000" cy="3694444"/>
+                    </a:xfrm>
+                    <a:prstGeom prst="rect">
+                      <a:avLst/>
+                    </a:prstGeom>
+                    <a:ln w="9525">
+                      <a:solidFill>
+                        <a:srgbClr val="DDDDDD"/>
+                      </a:solidFill>
+                    </a:ln>
+                  </pic:spPr>
+                </pic:pic>
+              </a:graphicData>
+            </a:graphic>
+          </wp:inline>
+        </w:drawing>
+      </w:r>
+    </w:p>
+    <w:p>
+      <w:pPr>
+        <w:spacing w:after="160"/>
+      </w:pPr>
+      <w:r>
+        <w:rPr>
+          <w:i/>
+          <w:color w:val="888888"/>
+          <w:sz w:val="18"/>
+        </w:rPr>
+        <w:t xml:space="preserve">Capture : Tableau de bord conseiller</w:t>
+      </w:r>
+    </w:p>
     <w:p>
       <w:pPr>
         <w:pStyle w:val="Heading2"/>
@@ -1427,64 +1435,66 @@
         <w:t xml:space="preserve">But : identifier visuellement le client rapidement.</w:t>
       </w:r>
     </w:p>
-    <w:tbl>
-      <w:tblPr>
-        <w:tblW w:w="9300" w:type="dxa"/>
-        <w:tblBorders>
-          <w:top w:val="dashed" w:sz="6" w:space="0" w:color="BBBBBB"/>
-          <w:left w:val="dashed" w:sz="6" w:space="0" w:color="BBBBBB"/>
-          <w:bottom w:val="dashed" w:sz="6" w:space="0" w:color="BBBBBB"/>
-          <w:right w:val="dashed" w:sz="6" w:space="0" w:color="BBBBBB"/>
-          <w:insideH w:val="dashed" w:sz="6" w:space="0" w:color="BBBBBB"/>
-          <w:insideV w:val="dashed" w:sz="6" w:space="0" w:color="BBBBBB"/>
-        </w:tblBorders>
-        <w:tblCellMar>
-          <w:top w:w="120" w:type="dxa"/>
-          <w:bottom w:w="120" w:type="dxa"/>
-        </w:tblCellMar>
-      </w:tblPr>
-      <w:tblGrid>
-        <w:gridCol w:w="9300"/>
-      </w:tblGrid>
-      <w:tr>
-        <w:tc>
-          <w:tcPr>
-            <w:tcW w:w="9300" w:type="dxa"/>
-            <w:shd w:val="clear" w:color="auto" w:fill="F4F4F4"/>
-            <w:vAlign w:val="center"/>
-          </w:tcPr>
-          <w:p>
-            <w:pPr>
-              <w:jc w:val="center"/>
-            </w:pPr>
-            <w:r>
-              <w:rPr>
-                <w:b/>
-                <w:color w:val="888888"/>
-              </w:rPr>
-              <w:t xml:space="preserve">📷 Capture : Recherche imprimeur + résultats</w:t>
-            </w:r>
-          </w:p>
-          <w:p>
-            <w:pPr>
-              <w:jc w:val="center"/>
-            </w:pPr>
-            <w:r>
-              <w:rPr>
-                <w:color w:val="AAAAAA"/>
-                <w:sz w:val="18"/>
-              </w:rPr>
-              <w:t>(insérer la copie d’écran ici)</w:t>
-            </w:r>
-          </w:p>
-          <w:p/>
-          <w:p/>
-          <w:p/>
-          <w:p/>
-        </w:tc>
-      </w:tr>
-    </w:tbl>
-    <w:p/>
+    <w:p>
+      <w:pPr>
+        <w:spacing w:before="80" w:after="40"/>
+      </w:pPr>
+      <w:r>
+        <w:drawing>
+          <wp:inline xmlns:wp="http://schemas.openxmlformats.org/drawingml/2006/wordprocessingDrawing" distT="0" distB="0" distL="0" distR="0">
+            <wp:extent cx="2104255" cy="4300000"/>
+            <wp:effectExtent l="0" t="0" r="0" b="0"/>
+            <wp:docPr id="105" name="img105"/>
+            <wp:cNvGraphicFramePr>
+              <a:graphicFrameLocks xmlns:a="http://schemas.openxmlformats.org/drawingml/2006/main" noChangeAspect="1"/>
+            </wp:cNvGraphicFramePr>
+            <a:graphic xmlns:a="http://schemas.openxmlformats.org/drawingml/2006/main">
+              <a:graphicData uri="http://schemas.openxmlformats.org/drawingml/2006/picture">
+                <pic:pic xmlns:pic="http://schemas.openxmlformats.org/drawingml/2006/picture">
+                  <pic:nvPicPr>
+                    <pic:cNvPr id="105" name="img105"/>
+                    <pic:cNvPicPr/>
+                  </pic:nvPicPr>
+                  <pic:blipFill>
+                    <a:blip xmlns:r="http://schemas.openxmlformats.org/officeDocument/2006/relationships" r:embed="rIdImg15"/>
+                    <a:stretch>
+                      <a:fillRect/>
+                    </a:stretch>
+                  </pic:blipFill>
+                  <pic:spPr>
+                    <a:xfrm>
+                      <a:off x="0" y="0"/>
+                      <a:ext cx="2104255" cy="4300000"/>
+                    </a:xfrm>
+                    <a:prstGeom prst="rect">
+                      <a:avLst/>
+                    </a:prstGeom>
+                    <a:ln w="9525">
+                      <a:solidFill>
+                        <a:srgbClr val="DDDDDD"/>
+                      </a:solidFill>
+                    </a:ln>
+                  </pic:spPr>
+                </pic:pic>
+              </a:graphicData>
+            </a:graphic>
+          </wp:inline>
+        </w:drawing>
+      </w:r>
+    </w:p>
+    <w:p>
+      <w:pPr>
+        <w:spacing w:after="160"/>
+      </w:pPr>
+      <w:r>
+        <w:rPr>
+          <w:i/>
+          <w:color w:val="888888"/>
+          <w:sz w:val="18"/>
+        </w:rPr>
+        <w:t xml:space="preserve">Capture : Recherche imprimeur + résultats</w:t>
+      </w:r>
+    </w:p>
     <w:p>
       <w:pPr>
         <w:pStyle w:val="Heading2"/>
@@ -1526,64 +1536,66 @@
         <w:t xml:space="preserve">Possibilité de reprendre une photo mal cadrée.</w:t>
       </w:r>
     </w:p>
-    <w:tbl>
-      <w:tblPr>
-        <w:tblW w:w="9300" w:type="dxa"/>
-        <w:tblBorders>
-          <w:top w:val="dashed" w:sz="6" w:space="0" w:color="BBBBBB"/>
-          <w:left w:val="dashed" w:sz="6" w:space="0" w:color="BBBBBB"/>
-          <w:bottom w:val="dashed" w:sz="6" w:space="0" w:color="BBBBBB"/>
-          <w:right w:val="dashed" w:sz="6" w:space="0" w:color="BBBBBB"/>
-          <w:insideH w:val="dashed" w:sz="6" w:space="0" w:color="BBBBBB"/>
-          <w:insideV w:val="dashed" w:sz="6" w:space="0" w:color="BBBBBB"/>
-        </w:tblBorders>
-        <w:tblCellMar>
-          <w:top w:w="120" w:type="dxa"/>
-          <w:bottom w:w="120" w:type="dxa"/>
-        </w:tblCellMar>
-      </w:tblPr>
-      <w:tblGrid>
-        <w:gridCol w:w="9300"/>
-      </w:tblGrid>
-      <w:tr>
-        <w:tc>
-          <w:tcPr>
-            <w:tcW w:w="9300" w:type="dxa"/>
-            <w:shd w:val="clear" w:color="auto" w:fill="F4F4F4"/>
-            <w:vAlign w:val="center"/>
-          </w:tcPr>
-          <w:p>
-            <w:pPr>
-              <w:jc w:val="center"/>
-            </w:pPr>
-            <w:r>
-              <w:rPr>
-                <w:b/>
-                <w:color w:val="888888"/>
-              </w:rPr>
-              <w:t xml:space="preserve">📷 Capture : Fiche complète du dossier</w:t>
-            </w:r>
-          </w:p>
-          <w:p>
-            <w:pPr>
-              <w:jc w:val="center"/>
-            </w:pPr>
-            <w:r>
-              <w:rPr>
-                <w:color w:val="AAAAAA"/>
-                <w:sz w:val="18"/>
-              </w:rPr>
-              <w:t>(insérer la copie d’écran ici)</w:t>
-            </w:r>
-          </w:p>
-          <w:p/>
-          <w:p/>
-          <w:p/>
-          <w:p/>
-        </w:tc>
-      </w:tr>
-    </w:tbl>
-    <w:p/>
+    <w:p>
+      <w:pPr>
+        <w:spacing w:before="80" w:after="40"/>
+      </w:pPr>
+      <w:r>
+        <w:drawing>
+          <wp:inline xmlns:wp="http://schemas.openxmlformats.org/drawingml/2006/wordprocessingDrawing" distT="0" distB="0" distL="0" distR="0">
+            <wp:extent cx="2104255" cy="4300000"/>
+            <wp:effectExtent l="0" t="0" r="0" b="0"/>
+            <wp:docPr id="106" name="img106"/>
+            <wp:cNvGraphicFramePr>
+              <a:graphicFrameLocks xmlns:a="http://schemas.openxmlformats.org/drawingml/2006/main" noChangeAspect="1"/>
+            </wp:cNvGraphicFramePr>
+            <a:graphic xmlns:a="http://schemas.openxmlformats.org/drawingml/2006/main">
+              <a:graphicData uri="http://schemas.openxmlformats.org/drawingml/2006/picture">
+                <pic:pic xmlns:pic="http://schemas.openxmlformats.org/drawingml/2006/picture">
+                  <pic:nvPicPr>
+                    <pic:cNvPr id="106" name="img106"/>
+                    <pic:cNvPicPr/>
+                  </pic:nvPicPr>
+                  <pic:blipFill>
+                    <a:blip xmlns:r="http://schemas.openxmlformats.org/officeDocument/2006/relationships" r:embed="rIdImg16"/>
+                    <a:stretch>
+                      <a:fillRect/>
+                    </a:stretch>
+                  </pic:blipFill>
+                  <pic:spPr>
+                    <a:xfrm>
+                      <a:off x="0" y="0"/>
+                      <a:ext cx="2104255" cy="4300000"/>
+                    </a:xfrm>
+                    <a:prstGeom prst="rect">
+                      <a:avLst/>
+                    </a:prstGeom>
+                    <a:ln w="9525">
+                      <a:solidFill>
+                        <a:srgbClr val="DDDDDD"/>
+                      </a:solidFill>
+                    </a:ln>
+                  </pic:spPr>
+                </pic:pic>
+              </a:graphicData>
+            </a:graphic>
+          </wp:inline>
+        </w:drawing>
+      </w:r>
+    </w:p>
+    <w:p>
+      <w:pPr>
+        <w:spacing w:after="160"/>
+      </w:pPr>
+      <w:r>
+        <w:rPr>
+          <w:i/>
+          <w:color w:val="888888"/>
+          <w:sz w:val="18"/>
+        </w:rPr>
+        <w:t xml:space="preserve">Capture : Fiche complète du dossier</w:t>
+      </w:r>
+    </w:p>
     <w:p>
       <w:pPr>
         <w:pStyle w:val="Heading2"/>
@@ -1831,64 +1843,66 @@
         <w:t xml:space="preserve">Répartition des ventes par conseiller.</w:t>
       </w:r>
     </w:p>
-    <w:tbl>
-      <w:tblPr>
-        <w:tblW w:w="9300" w:type="dxa"/>
-        <w:tblBorders>
-          <w:top w:val="dashed" w:sz="6" w:space="0" w:color="BBBBBB"/>
-          <w:left w:val="dashed" w:sz="6" w:space="0" w:color="BBBBBB"/>
-          <w:bottom w:val="dashed" w:sz="6" w:space="0" w:color="BBBBBB"/>
-          <w:right w:val="dashed" w:sz="6" w:space="0" w:color="BBBBBB"/>
-          <w:insideH w:val="dashed" w:sz="6" w:space="0" w:color="BBBBBB"/>
-          <w:insideV w:val="dashed" w:sz="6" w:space="0" w:color="BBBBBB"/>
-        </w:tblBorders>
-        <w:tblCellMar>
-          <w:top w:w="120" w:type="dxa"/>
-          <w:bottom w:w="120" w:type="dxa"/>
-        </w:tblCellMar>
-      </w:tblPr>
-      <w:tblGrid>
-        <w:gridCol w:w="9300"/>
-      </w:tblGrid>
-      <w:tr>
-        <w:tc>
-          <w:tcPr>
-            <w:tcW w:w="9300" w:type="dxa"/>
-            <w:shd w:val="clear" w:color="auto" w:fill="F4F4F4"/>
-            <w:vAlign w:val="center"/>
-          </w:tcPr>
-          <w:p>
-            <w:pPr>
-              <w:jc w:val="center"/>
-            </w:pPr>
-            <w:r>
-              <w:rPr>
-                <w:b/>
-                <w:color w:val="888888"/>
-              </w:rPr>
-              <w:t xml:space="preserve">📷 Capture : Tableau de bord — KPI</w:t>
-            </w:r>
-          </w:p>
-          <w:p>
-            <w:pPr>
-              <w:jc w:val="center"/>
-            </w:pPr>
-            <w:r>
-              <w:rPr>
-                <w:color w:val="AAAAAA"/>
-                <w:sz w:val="18"/>
-              </w:rPr>
-              <w:t>(insérer la copie d’écran ici)</w:t>
-            </w:r>
-          </w:p>
-          <w:p/>
-          <w:p/>
-          <w:p/>
-          <w:p/>
-        </w:tc>
-      </w:tr>
-    </w:tbl>
-    <w:p/>
+    <w:p>
+      <w:pPr>
+        <w:spacing w:before="80" w:after="40"/>
+      </w:pPr>
+      <w:r>
+        <w:drawing>
+          <wp:inline xmlns:wp="http://schemas.openxmlformats.org/drawingml/2006/wordprocessingDrawing" distT="0" distB="0" distL="0" distR="0">
+            <wp:extent cx="5600000" cy="3694444"/>
+            <wp:effectExtent l="0" t="0" r="0" b="0"/>
+            <wp:docPr id="107" name="img107"/>
+            <wp:cNvGraphicFramePr>
+              <a:graphicFrameLocks xmlns:a="http://schemas.openxmlformats.org/drawingml/2006/main" noChangeAspect="1"/>
+            </wp:cNvGraphicFramePr>
+            <a:graphic xmlns:a="http://schemas.openxmlformats.org/drawingml/2006/main">
+              <a:graphicData uri="http://schemas.openxmlformats.org/drawingml/2006/picture">
+                <pic:pic xmlns:pic="http://schemas.openxmlformats.org/drawingml/2006/picture">
+                  <pic:nvPicPr>
+                    <pic:cNvPr id="107" name="img107"/>
+                    <pic:cNvPicPr/>
+                  </pic:nvPicPr>
+                  <pic:blipFill>
+                    <a:blip xmlns:r="http://schemas.openxmlformats.org/officeDocument/2006/relationships" r:embed="rIdImg17"/>
+                    <a:stretch>
+                      <a:fillRect/>
+                    </a:stretch>
+                  </pic:blipFill>
+                  <pic:spPr>
+                    <a:xfrm>
+                      <a:off x="0" y="0"/>
+                      <a:ext cx="5600000" cy="3694444"/>
+                    </a:xfrm>
+                    <a:prstGeom prst="rect">
+                      <a:avLst/>
+                    </a:prstGeom>
+                    <a:ln w="9525">
+                      <a:solidFill>
+                        <a:srgbClr val="DDDDDD"/>
+                      </a:solidFill>
+                    </a:ln>
+                  </pic:spPr>
+                </pic:pic>
+              </a:graphicData>
+            </a:graphic>
+          </wp:inline>
+        </w:drawing>
+      </w:r>
+    </w:p>
+    <w:p>
+      <w:pPr>
+        <w:spacing w:after="160"/>
+      </w:pPr>
+      <w:r>
+        <w:rPr>
+          <w:i/>
+          <w:color w:val="888888"/>
+          <w:sz w:val="18"/>
+        </w:rPr>
+        <w:t xml:space="preserve">Capture : Tableau de bord — KPI</w:t>
+      </w:r>
+    </w:p>
     <w:p>
       <w:pPr>
         <w:pStyle w:val="Heading2"/>
@@ -1930,278 +1944,172 @@
         <w:t xml:space="preserve">« Enregistrer ».</w:t>
       </w:r>
     </w:p>
-    <w:tbl>
-      <w:tblPr>
-        <w:tblW w:w="9300" w:type="dxa"/>
-        <w:tblBorders>
-          <w:top w:val="dashed" w:sz="6" w:space="0" w:color="BBBBBB"/>
-          <w:left w:val="dashed" w:sz="6" w:space="0" w:color="BBBBBB"/>
-          <w:bottom w:val="dashed" w:sz="6" w:space="0" w:color="BBBBBB"/>
-          <w:right w:val="dashed" w:sz="6" w:space="0" w:color="BBBBBB"/>
-          <w:insideH w:val="dashed" w:sz="6" w:space="0" w:color="BBBBBB"/>
-          <w:insideV w:val="dashed" w:sz="6" w:space="0" w:color="BBBBBB"/>
-        </w:tblBorders>
-        <w:tblCellMar>
-          <w:top w:w="120" w:type="dxa"/>
-          <w:bottom w:w="120" w:type="dxa"/>
-        </w:tblCellMar>
-      </w:tblPr>
-      <w:tblGrid>
-        <w:gridCol w:w="9300"/>
-      </w:tblGrid>
-      <w:tr>
-        <w:tc>
-          <w:tcPr>
-            <w:tcW w:w="9300" w:type="dxa"/>
-            <w:shd w:val="clear" w:color="auto" w:fill="F4F4F4"/>
-            <w:vAlign w:val="center"/>
-          </w:tcPr>
-          <w:p>
-            <w:pPr>
-              <w:jc w:val="center"/>
-            </w:pPr>
-            <w:r>
-              <w:rPr>
-                <w:b/>
-                <w:color w:val="888888"/>
-              </w:rPr>
-              <w:t xml:space="preserve">📷 Capture : Configuration carte</w:t>
-            </w:r>
-          </w:p>
-          <w:p>
-            <w:pPr>
-              <w:jc w:val="center"/>
-            </w:pPr>
-            <w:r>
-              <w:rPr>
-                <w:color w:val="AAAAAA"/>
-                <w:sz w:val="18"/>
-              </w:rPr>
-              <w:t>(insérer la copie d’écran ici)</w:t>
-            </w:r>
-          </w:p>
-          <w:p/>
-          <w:p/>
-          <w:p/>
-          <w:p/>
-        </w:tc>
-      </w:tr>
-    </w:tbl>
-    <w:p/>
+    <w:p>
+      <w:pPr>
+        <w:spacing w:before="80" w:after="40"/>
+      </w:pPr>
+      <w:r>
+        <w:drawing>
+          <wp:inline xmlns:wp="http://schemas.openxmlformats.org/drawingml/2006/wordprocessingDrawing" distT="0" distB="0" distL="0" distR="0">
+            <wp:extent cx="5600000" cy="3694444"/>
+            <wp:effectExtent l="0" t="0" r="0" b="0"/>
+            <wp:docPr id="108" name="img108"/>
+            <wp:cNvGraphicFramePr>
+              <a:graphicFrameLocks xmlns:a="http://schemas.openxmlformats.org/drawingml/2006/main" noChangeAspect="1"/>
+            </wp:cNvGraphicFramePr>
+            <a:graphic xmlns:a="http://schemas.openxmlformats.org/drawingml/2006/main">
+              <a:graphicData uri="http://schemas.openxmlformats.org/drawingml/2006/picture">
+                <pic:pic xmlns:pic="http://schemas.openxmlformats.org/drawingml/2006/picture">
+                  <pic:nvPicPr>
+                    <pic:cNvPr id="108" name="img108"/>
+                    <pic:cNvPicPr/>
+                  </pic:nvPicPr>
+                  <pic:blipFill>
+                    <a:blip xmlns:r="http://schemas.openxmlformats.org/officeDocument/2006/relationships" r:embed="rIdImg18"/>
+                    <a:stretch>
+                      <a:fillRect/>
+                    </a:stretch>
+                  </pic:blipFill>
+                  <pic:spPr>
+                    <a:xfrm>
+                      <a:off x="0" y="0"/>
+                      <a:ext cx="5600000" cy="3694444"/>
+                    </a:xfrm>
+                    <a:prstGeom prst="rect">
+                      <a:avLst/>
+                    </a:prstGeom>
+                    <a:ln w="9525">
+                      <a:solidFill>
+                        <a:srgbClr val="DDDDDD"/>
+                      </a:solidFill>
+                    </a:ln>
+                  </pic:spPr>
+                </pic:pic>
+              </a:graphicData>
+            </a:graphic>
+          </wp:inline>
+        </w:drawing>
+      </w:r>
+    </w:p>
+    <w:p>
+      <w:pPr>
+        <w:spacing w:after="160"/>
+      </w:pPr>
+      <w:r>
+        <w:rPr>
+          <w:i/>
+          <w:color w:val="888888"/>
+          <w:sz w:val="18"/>
+        </w:rPr>
+        <w:t xml:space="preserve">Capture : Configuration carte</w:t>
+      </w:r>
+    </w:p>
     <w:p>
       <w:pPr>
         <w:pStyle w:val="Heading2"/>
       </w:pPr>
       <w:r>
-        <w:t xml:space="preserve">Utilisateurs — créer un compte</w:t>
-      </w:r>
-    </w:p>
-    <w:p>
-      <w:pPr>
-        <w:numPr>
-          <w:ilvl w:val="0"/>
-          <w:numId w:val="1"/>
-        </w:numPr>
-      </w:pPr>
-      <w:r>
-        <w:t xml:space="preserve">Renseigner nom, e-mail, rôle, mot de passe.</w:t>
-      </w:r>
-    </w:p>
-    <w:p>
-      <w:pPr>
-        <w:numPr>
-          <w:ilvl w:val="0"/>
-          <w:numId w:val="1"/>
-        </w:numPr>
-      </w:pPr>
-      <w:r>
-        <w:t xml:space="preserve">Pour un conseiller : agence + téléphone (9 chiffres) obligatoires.</w:t>
-      </w:r>
-    </w:p>
-    <w:p>
-      <w:pPr>
-        <w:numPr>
-          <w:ilvl w:val="0"/>
-          <w:numId w:val="1"/>
-        </w:numPr>
-      </w:pPr>
-      <w:r>
-        <w:t xml:space="preserve">La liste des comptes existants est affichée en dessous.</w:t>
-      </w:r>
-    </w:p>
-    <w:tbl>
-      <w:tblPr>
-        <w:tblW w:w="9300" w:type="dxa"/>
-        <w:tblBorders>
-          <w:top w:val="dashed" w:sz="6" w:space="0" w:color="BBBBBB"/>
-          <w:left w:val="dashed" w:sz="6" w:space="0" w:color="BBBBBB"/>
-          <w:bottom w:val="dashed" w:sz="6" w:space="0" w:color="BBBBBB"/>
-          <w:right w:val="dashed" w:sz="6" w:space="0" w:color="BBBBBB"/>
-          <w:insideH w:val="dashed" w:sz="6" w:space="0" w:color="BBBBBB"/>
-          <w:insideV w:val="dashed" w:sz="6" w:space="0" w:color="BBBBBB"/>
-        </w:tblBorders>
-        <w:tblCellMar>
-          <w:top w:w="120" w:type="dxa"/>
-          <w:bottom w:w="120" w:type="dxa"/>
-        </w:tblCellMar>
-      </w:tblPr>
-      <w:tblGrid>
-        <w:gridCol w:w="9300"/>
-      </w:tblGrid>
-      <w:tr>
-        <w:tc>
-          <w:tcPr>
-            <w:tcW w:w="9300" w:type="dxa"/>
-            <w:shd w:val="clear" w:color="auto" w:fill="F4F4F4"/>
-            <w:vAlign w:val="center"/>
-          </w:tcPr>
-          <w:p>
-            <w:pPr>
-              <w:jc w:val="center"/>
-            </w:pPr>
-            <w:r>
-              <w:rPr>
-                <w:b/>
-                <w:color w:val="888888"/>
-              </w:rPr>
-              <w:t xml:space="preserve">📷 Capture : Création d'un utilisateur</w:t>
-            </w:r>
-          </w:p>
-          <w:p>
-            <w:pPr>
-              <w:jc w:val="center"/>
-            </w:pPr>
-            <w:r>
-              <w:rPr>
-                <w:color w:val="AAAAAA"/>
-                <w:sz w:val="18"/>
-              </w:rPr>
-              <w:t>(insérer la copie d’écran ici)</w:t>
-            </w:r>
-          </w:p>
-          <w:p/>
-          <w:p/>
-          <w:p/>
-          <w:p/>
-        </w:tc>
-      </w:tr>
-    </w:tbl>
-    <w:p/>
+        <w:t xml:space="preserve">Utilisateurs (création &amp; import)</w:t>
+      </w:r>
+    </w:p>
+    <w:p>
+      <w:pPr>
+        <w:numPr>
+          <w:ilvl w:val="0"/>
+          <w:numId w:val="1"/>
+        </w:numPr>
+      </w:pPr>
+      <w:r>
+        <w:t xml:space="preserve">Créer un compte (nom, e-mail, rôle, mot de passe ; agence + téléphone pour un conseiller).</w:t>
+      </w:r>
+    </w:p>
+    <w:p>
+      <w:pPr>
+        <w:numPr>
+          <w:ilvl w:val="0"/>
+          <w:numId w:val="1"/>
+        </w:numPr>
+      </w:pPr>
+      <w:r>
+        <w:t xml:space="preserve">Import en masse : CSV ou coller un tableau ; aperçu Nouveau / Doublon / Invalide.</w:t>
+      </w:r>
+    </w:p>
+    <w:p>
+      <w:pPr>
+        <w:numPr>
+          <w:ilvl w:val="0"/>
+          <w:numId w:val="1"/>
+        </w:numPr>
+      </w:pPr>
+      <w:r>
+        <w:t xml:space="preserve">Doublons : ignorer ou mettre à jour ; mots de passe temporaires générés + export CSV.</w:t>
+      </w:r>
+    </w:p>
+    <w:p>
+      <w:pPr>
+        <w:spacing w:before="80" w:after="40"/>
+      </w:pPr>
+      <w:r>
+        <w:drawing>
+          <wp:inline xmlns:wp="http://schemas.openxmlformats.org/drawingml/2006/wordprocessingDrawing" distT="0" distB="0" distL="0" distR="0">
+            <wp:extent cx="5600000" cy="3694444"/>
+            <wp:effectExtent l="0" t="0" r="0" b="0"/>
+            <wp:docPr id="109" name="img109"/>
+            <wp:cNvGraphicFramePr>
+              <a:graphicFrameLocks xmlns:a="http://schemas.openxmlformats.org/drawingml/2006/main" noChangeAspect="1"/>
+            </wp:cNvGraphicFramePr>
+            <a:graphic xmlns:a="http://schemas.openxmlformats.org/drawingml/2006/main">
+              <a:graphicData uri="http://schemas.openxmlformats.org/drawingml/2006/picture">
+                <pic:pic xmlns:pic="http://schemas.openxmlformats.org/drawingml/2006/picture">
+                  <pic:nvPicPr>
+                    <pic:cNvPr id="109" name="img109"/>
+                    <pic:cNvPicPr/>
+                  </pic:nvPicPr>
+                  <pic:blipFill>
+                    <a:blip xmlns:r="http://schemas.openxmlformats.org/officeDocument/2006/relationships" r:embed="rIdImg19"/>
+                    <a:stretch>
+                      <a:fillRect/>
+                    </a:stretch>
+                  </pic:blipFill>
+                  <pic:spPr>
+                    <a:xfrm>
+                      <a:off x="0" y="0"/>
+                      <a:ext cx="5600000" cy="3694444"/>
+                    </a:xfrm>
+                    <a:prstGeom prst="rect">
+                      <a:avLst/>
+                    </a:prstGeom>
+                    <a:ln w="9525">
+                      <a:solidFill>
+                        <a:srgbClr val="DDDDDD"/>
+                      </a:solidFill>
+                    </a:ln>
+                  </pic:spPr>
+                </pic:pic>
+              </a:graphicData>
+            </a:graphic>
+          </wp:inline>
+        </w:drawing>
+      </w:r>
+    </w:p>
+    <w:p>
+      <w:pPr>
+        <w:spacing w:after="160"/>
+      </w:pPr>
+      <w:r>
+        <w:rPr>
+          <w:i/>
+          <w:color w:val="888888"/>
+          <w:sz w:val="18"/>
+        </w:rPr>
+        <w:t xml:space="preserve">Capture : Utilisateurs / import</w:t>
+      </w:r>
+    </w:p>
     <w:p>
       <w:pPr>
         <w:pStyle w:val="Heading2"/>
       </w:pPr>
       <w:r>
-        <w:t xml:space="preserve">Utilisateurs — import en masse</w:t>
-      </w:r>
-    </w:p>
-    <w:p>
-      <w:pPr>
-        <w:numPr>
-          <w:ilvl w:val="0"/>
-          <w:numId w:val="1"/>
-        </w:numPr>
-      </w:pPr>
-      <w:r>
-        <w:t xml:space="preserve">Charger un fichier CSV (modèle téléchargeable) OU coller un tableau Excel.</w:t>
-      </w:r>
-    </w:p>
-    <w:p>
-      <w:pPr>
-        <w:numPr>
-          <w:ilvl w:val="0"/>
-          <w:numId w:val="1"/>
-        </w:numPr>
-      </w:pPr>
-      <w:r>
-        <w:t xml:space="preserve">Aperçu : chaque ligne étiquetée Nouveau / Doublon / Invalide.</w:t>
-      </w:r>
-    </w:p>
-    <w:p>
-      <w:pPr>
-        <w:numPr>
-          <w:ilvl w:val="0"/>
-          <w:numId w:val="1"/>
-        </w:numPr>
-      </w:pPr>
-      <w:r>
-        <w:t xml:space="preserve">Choisir « Ignorer les doublons » ou « Mettre à jour », puis « Importer ».</w:t>
-      </w:r>
-    </w:p>
-    <w:p>
-      <w:pPr>
-        <w:numPr>
-          <w:ilvl w:val="0"/>
-          <w:numId w:val="1"/>
-        </w:numPr>
-      </w:pPr>
-      <w:r>
-        <w:t xml:space="preserve">Mots de passe temporaires générés + export CSV des identifiants à communiquer.</w:t>
-      </w:r>
-    </w:p>
-    <w:tbl>
-      <w:tblPr>
-        <w:tblW w:w="9300" w:type="dxa"/>
-        <w:tblBorders>
-          <w:top w:val="dashed" w:sz="6" w:space="0" w:color="BBBBBB"/>
-          <w:left w:val="dashed" w:sz="6" w:space="0" w:color="BBBBBB"/>
-          <w:bottom w:val="dashed" w:sz="6" w:space="0" w:color="BBBBBB"/>
-          <w:right w:val="dashed" w:sz="6" w:space="0" w:color="BBBBBB"/>
-          <w:insideH w:val="dashed" w:sz="6" w:space="0" w:color="BBBBBB"/>
-          <w:insideV w:val="dashed" w:sz="6" w:space="0" w:color="BBBBBB"/>
-        </w:tblBorders>
-        <w:tblCellMar>
-          <w:top w:w="120" w:type="dxa"/>
-          <w:bottom w:w="120" w:type="dxa"/>
-        </w:tblCellMar>
-      </w:tblPr>
-      <w:tblGrid>
-        <w:gridCol w:w="9300"/>
-      </w:tblGrid>
-      <w:tr>
-        <w:tc>
-          <w:tcPr>
-            <w:tcW w:w="9300" w:type="dxa"/>
-            <w:shd w:val="clear" w:color="auto" w:fill="F4F4F4"/>
-            <w:vAlign w:val="center"/>
-          </w:tcPr>
-          <w:p>
-            <w:pPr>
-              <w:jc w:val="center"/>
-            </w:pPr>
-            <w:r>
-              <w:rPr>
-                <w:b/>
-                <w:color w:val="888888"/>
-              </w:rPr>
-              <w:t xml:space="preserve">📷 Capture : Import d'utilisateurs (aperçu)</w:t>
-            </w:r>
-          </w:p>
-          <w:p>
-            <w:pPr>
-              <w:jc w:val="center"/>
-            </w:pPr>
-            <w:r>
-              <w:rPr>
-                <w:color w:val="AAAAAA"/>
-                <w:sz w:val="18"/>
-              </w:rPr>
-              <w:t>(insérer la copie d’écran ici)</w:t>
-            </w:r>
-          </w:p>
-          <w:p/>
-          <w:p/>
-          <w:p/>
-          <w:p/>
-        </w:tc>
-      </w:tr>
-    </w:tbl>
-    <w:p/>
-    <w:p>
-      <w:pPr>
-        <w:pStyle w:val="Heading2"/>
-      </w:pPr>
-      <w:r>
         <w:t xml:space="preserve">Historique des paiements</w:t>
       </w:r>
     </w:p>
@@ -2238,64 +2146,66 @@
         <w:t xml:space="preserve">Pagination ; clic sur une ligne = détail complet ; export CSV.</w:t>
       </w:r>
     </w:p>
-    <w:tbl>
-      <w:tblPr>
-        <w:tblW w:w="9300" w:type="dxa"/>
-        <w:tblBorders>
-          <w:top w:val="dashed" w:sz="6" w:space="0" w:color="BBBBBB"/>
-          <w:left w:val="dashed" w:sz="6" w:space="0" w:color="BBBBBB"/>
-          <w:bottom w:val="dashed" w:sz="6" w:space="0" w:color="BBBBBB"/>
-          <w:right w:val="dashed" w:sz="6" w:space="0" w:color="BBBBBB"/>
-          <w:insideH w:val="dashed" w:sz="6" w:space="0" w:color="BBBBBB"/>
-          <w:insideV w:val="dashed" w:sz="6" w:space="0" w:color="BBBBBB"/>
-        </w:tblBorders>
-        <w:tblCellMar>
-          <w:top w:w="120" w:type="dxa"/>
-          <w:bottom w:w="120" w:type="dxa"/>
-        </w:tblCellMar>
-      </w:tblPr>
-      <w:tblGrid>
-        <w:gridCol w:w="9300"/>
-      </w:tblGrid>
-      <w:tr>
-        <w:tc>
-          <w:tcPr>
-            <w:tcW w:w="9300" w:type="dxa"/>
-            <w:shd w:val="clear" w:color="auto" w:fill="F4F4F4"/>
-            <w:vAlign w:val="center"/>
-          </w:tcPr>
-          <w:p>
-            <w:pPr>
-              <w:jc w:val="center"/>
-            </w:pPr>
-            <w:r>
-              <w:rPr>
-                <w:b/>
-                <w:color w:val="888888"/>
-              </w:rPr>
-              <w:t xml:space="preserve">📷 Capture : Tableau des transactions</w:t>
-            </w:r>
-          </w:p>
-          <w:p>
-            <w:pPr>
-              <w:jc w:val="center"/>
-            </w:pPr>
-            <w:r>
-              <w:rPr>
-                <w:color w:val="AAAAAA"/>
-                <w:sz w:val="18"/>
-              </w:rPr>
-              <w:t>(insérer la copie d’écran ici)</w:t>
-            </w:r>
-          </w:p>
-          <w:p/>
-          <w:p/>
-          <w:p/>
-          <w:p/>
-        </w:tc>
-      </w:tr>
-    </w:tbl>
-    <w:p/>
+    <w:p>
+      <w:pPr>
+        <w:spacing w:before="80" w:after="40"/>
+      </w:pPr>
+      <w:r>
+        <w:drawing>
+          <wp:inline xmlns:wp="http://schemas.openxmlformats.org/drawingml/2006/wordprocessingDrawing" distT="0" distB="0" distL="0" distR="0">
+            <wp:extent cx="5600000" cy="3694444"/>
+            <wp:effectExtent l="0" t="0" r="0" b="0"/>
+            <wp:docPr id="110" name="img110"/>
+            <wp:cNvGraphicFramePr>
+              <a:graphicFrameLocks xmlns:a="http://schemas.openxmlformats.org/drawingml/2006/main" noChangeAspect="1"/>
+            </wp:cNvGraphicFramePr>
+            <a:graphic xmlns:a="http://schemas.openxmlformats.org/drawingml/2006/main">
+              <a:graphicData uri="http://schemas.openxmlformats.org/drawingml/2006/picture">
+                <pic:pic xmlns:pic="http://schemas.openxmlformats.org/drawingml/2006/picture">
+                  <pic:nvPicPr>
+                    <pic:cNvPr id="110" name="img110"/>
+                    <pic:cNvPicPr/>
+                  </pic:nvPicPr>
+                  <pic:blipFill>
+                    <a:blip xmlns:r="http://schemas.openxmlformats.org/officeDocument/2006/relationships" r:embed="rIdImg20"/>
+                    <a:stretch>
+                      <a:fillRect/>
+                    </a:stretch>
+                  </pic:blipFill>
+                  <pic:spPr>
+                    <a:xfrm>
+                      <a:off x="0" y="0"/>
+                      <a:ext cx="5600000" cy="3694444"/>
+                    </a:xfrm>
+                    <a:prstGeom prst="rect">
+                      <a:avLst/>
+                    </a:prstGeom>
+                    <a:ln w="9525">
+                      <a:solidFill>
+                        <a:srgbClr val="DDDDDD"/>
+                      </a:solidFill>
+                    </a:ln>
+                  </pic:spPr>
+                </pic:pic>
+              </a:graphicData>
+            </a:graphic>
+          </wp:inline>
+        </w:drawing>
+      </w:r>
+    </w:p>
+    <w:p>
+      <w:pPr>
+        <w:spacing w:after="160"/>
+      </w:pPr>
+      <w:r>
+        <w:rPr>
+          <w:i/>
+          <w:color w:val="888888"/>
+          <w:sz w:val="18"/>
+        </w:rPr>
+        <w:t xml:space="preserve">Capture : Tableau des transactions</w:t>
+      </w:r>
+    </w:p>
     <w:p>
       <w:pPr>
         <w:pStyle w:val="Heading1"/>

</xml_diff>